<commit_message>
update Enhanced PET rescaling and readme
</commit_message>
<xml_diff>
--- a/docs/suv.docx
+++ b/docs/suv.docx
@@ -15763,7 +15763,19 @@
           <w:bCs/>
           <w:b/>
         </w:rPr>
-        <w:t xml:space="preserve">Real World Value Slope (0040,9225) and Real World Value Intercept (0040,9224) must be present in the Real World Value Mapping Sequence (0040,9096), otherwise, SUV</w:t>
+        <w:t xml:space="preserve">At least one Real World Value Mapping Sequence (0040,9096) containing sufficient information for conversion to SUV or Bq/ml must be present;</w:t>
+      </w:r>
+      <w:r>
+        <w:t xml:space="preserve"> </w:t>
+      </w:r>
+      <w:r>
+        <w:rPr>
+          <w:iCs/>
+          <w:i/>
+          <w:bCs/>
+          <w:b/>
+        </w:rPr>
+        <w:t xml:space="preserve">otherwise, SUV</w:t>
       </w:r>
       <w:r>
         <w:rPr>
@@ -15803,7 +15815,19 @@
           <w:bCs/>
           <w:b/>
         </w:rPr>
-        <w:t xml:space="preserve">The corresponding slope and intercept have to be applied to all stored voxel values within a frame.</w:t>
+        <w:t xml:space="preserve">The information consists of rescaling data, i.e, the Real World Value Slope (0040,9225) and Real World Value Intercept (0040,9224) or the Real World Value LUT Data (0040,9212)</w:t>
+      </w:r>
+      <w:r>
+        <w:t xml:space="preserve"> </w:t>
+      </w:r>
+      <w:r>
+        <w:rPr>
+          <w:iCs/>
+          <w:i/>
+          <w:bCs/>
+          <w:b/>
+        </w:rPr>
+        <w:t xml:space="preserve">and the physical units, specified in the Measurement Units Code Sequence (0040, 08EA).</w:t>
       </w:r>
     </w:p>
     <w:p>
@@ -15811,13 +15835,7 @@
         <w:pStyle w:val="BodyText"/>
       </w:pPr>
       <w:r>
-        <w:t xml:space="preserve">Justification: Analogous to the Positron Emission Tomography SOP Class, differently encoded.</w:t>
-      </w:r>
-      <w:r>
-        <w:t xml:space="preserve"> </w:t>
-      </w:r>
-      <w:r>
-        <w:t xml:space="preserve">Rescale Slope (0028,1053) and Rescale Intercept (0028,1052) may not always lead to the unit specified in the Measurement Units Code Sequence (0040, 08EA).</w:t>
+        <w:t xml:space="preserve">Justification: Typically, the Real World Value Slope (0040,9225) and Real World Value Intercept (0040,9224) are present and can be applied analogously as the Rescale Slope and Rescale Intercept in the Positron Emission Tomography SOP Class</w:t>
       </w:r>
     </w:p>
     <w:p>
@@ -15831,19 +15849,7 @@
           <w:bCs/>
           <w:b/>
         </w:rPr>
-        <w:t xml:space="preserve">Units code must be present in the Measurement Units Code Sequence (0040, 08EA), and correspond either to Bq/ml or SUV (g/ml or cm2/ml),</w:t>
-      </w:r>
-      <w:r>
-        <w:t xml:space="preserve"> </w:t>
-      </w:r>
-      <w:r>
-        <w:rPr>
-          <w:iCs/>
-          <w:i/>
-          <w:bCs/>
-          <w:b/>
-        </w:rPr>
-        <w:t xml:space="preserve">otherwise, SUV</w:t>
+        <w:t xml:space="preserve">If a Real World Value Mapping Sequence (0040,9096) containing sufficient data for conversion to SUV</w:t>
       </w:r>
       <w:r>
         <w:rPr>
@@ -15871,6 +15877,290 @@
           <w:bCs/>
           <w:b/>
         </w:rPr>
+        <w:t xml:space="preserve">is present, the values should be converted to SUV</w:t>
+      </w:r>
+      <w:r>
+        <w:rPr>
+          <w:vertAlign w:val="subscript"/>
+          <w:iCs/>
+          <w:i/>
+          <w:bCs/>
+          <w:b/>
+        </w:rPr>
+        <w:t xml:space="preserve">bw</w:t>
+      </w:r>
+      <w:r>
+        <w:rPr>
+          <w:iCs/>
+          <w:i/>
+          <w:bCs/>
+          <w:b/>
+        </w:rPr>
+        <w:t xml:space="preserve"> </w:t>
+      </w:r>
+      <w:r>
+        <w:rPr>
+          <w:iCs/>
+          <w:i/>
+          <w:bCs/>
+          <w:b/>
+        </w:rPr>
+        <w:t xml:space="preserve">using this sequence.</w:t>
+      </w:r>
+      <w:r>
+        <w:t xml:space="preserve"> </w:t>
+      </w:r>
+      <w:r>
+        <w:rPr>
+          <w:iCs/>
+          <w:i/>
+          <w:bCs/>
+          <w:b/>
+        </w:rPr>
+        <w:t xml:space="preserve">If no Real World Value Mapping Sequence (0040,9096) containing sufficient data for conversion to SUV</w:t>
+      </w:r>
+      <w:r>
+        <w:rPr>
+          <w:vertAlign w:val="subscript"/>
+          <w:iCs/>
+          <w:i/>
+          <w:bCs/>
+          <w:b/>
+        </w:rPr>
+        <w:t xml:space="preserve">bw</w:t>
+      </w:r>
+      <w:r>
+        <w:rPr>
+          <w:iCs/>
+          <w:i/>
+          <w:bCs/>
+          <w:b/>
+        </w:rPr>
+        <w:t xml:space="preserve"> </w:t>
+      </w:r>
+      <w:r>
+        <w:rPr>
+          <w:iCs/>
+          <w:i/>
+          <w:bCs/>
+          <w:b/>
+        </w:rPr>
+        <w:t xml:space="preserve">is present</w:t>
+      </w:r>
+      <w:r>
+        <w:t xml:space="preserve"> </w:t>
+      </w:r>
+      <w:r>
+        <w:rPr>
+          <w:iCs/>
+          <w:i/>
+          <w:bCs/>
+          <w:b/>
+        </w:rPr>
+        <w:t xml:space="preserve">and a Real World Value Mapping Sequence (0040,9096) containing sufficient data for conversion to another SUV type is present, the values should be converted to this SUV type using this sequence.</w:t>
+      </w:r>
+    </w:p>
+    <w:p>
+      <w:pPr>
+        <w:pStyle w:val="BodyText"/>
+      </w:pPr>
+      <w:r>
+        <w:rPr>
+          <w:iCs/>
+          <w:i/>
+          <w:bCs/>
+          <w:b/>
+        </w:rPr>
+        <w:t xml:space="preserve">If no Real World Value Mapping Sequence (0040,9096) containing sufficient data for conversion to SUV</w:t>
+      </w:r>
+      <w:r>
+        <w:rPr>
+          <w:vertAlign w:val="subscript"/>
+          <w:iCs/>
+          <w:i/>
+          <w:bCs/>
+          <w:b/>
+        </w:rPr>
+        <w:t xml:space="preserve">bw</w:t>
+      </w:r>
+      <w:r>
+        <w:rPr>
+          <w:iCs/>
+          <w:i/>
+          <w:bCs/>
+          <w:b/>
+        </w:rPr>
+        <w:t xml:space="preserve"> </w:t>
+      </w:r>
+      <w:r>
+        <w:rPr>
+          <w:iCs/>
+          <w:i/>
+          <w:bCs/>
+          <w:b/>
+        </w:rPr>
+        <w:t xml:space="preserve">or another SUV type is present</w:t>
+      </w:r>
+      <w:r>
+        <w:t xml:space="preserve"> </w:t>
+      </w:r>
+      <w:r>
+        <w:rPr>
+          <w:iCs/>
+          <w:i/>
+          <w:bCs/>
+          <w:b/>
+        </w:rPr>
+        <w:t xml:space="preserve">and a Real World Value Mapping Sequence (0040,9096) containing sufficient data for conversion to another Bq/ml type is present, the values should be converted to Bq/ml using this sequence,</w:t>
+      </w:r>
+      <w:r>
+        <w:t xml:space="preserve"> </w:t>
+      </w:r>
+      <w:r>
+        <w:rPr>
+          <w:iCs/>
+          <w:i/>
+          <w:bCs/>
+          <w:b/>
+        </w:rPr>
+        <w:t xml:space="preserve">and dose correction are required.</w:t>
+      </w:r>
+    </w:p>
+    <w:p>
+      <w:pPr>
+        <w:pStyle w:val="BodyText"/>
+      </w:pPr>
+      <w:r>
+        <w:t xml:space="preserve">Justification: Unit code can be stored either in (0008,0100) Code Value, (0008,0119) Long Code Value, or (0008,0120) URN Code Value.</w:t>
+      </w:r>
+      <w:r>
+        <w:t xml:space="preserve"> </w:t>
+      </w:r>
+      <w:r>
+        <w:t xml:space="preserve">Multiple instances of Real World Value Mapping Sequence may be present and the one leading to SUV</w:t>
+      </w:r>
+      <w:r>
+        <w:rPr>
+          <w:vertAlign w:val="subscript"/>
+        </w:rPr>
+        <w:t xml:space="preserve">bw</w:t>
+      </w:r>
+      <w:r>
+        <w:t xml:space="preserve"> </w:t>
+      </w:r>
+      <w:r>
+        <w:t xml:space="preserve">or another SUV type should be prioritized.</w:t>
+      </w:r>
+    </w:p>
+    <w:p>
+      <w:pPr>
+        <w:pStyle w:val="BodyText"/>
+      </w:pPr>
+      <w:r>
+        <w:rPr>
+          <w:iCs/>
+          <w:i/>
+          <w:bCs/>
+          <w:b/>
+        </w:rPr>
+        <w:t xml:space="preserve">If no Real World Value Mapping Sequence (0040,9096) containing sufficient information for conversion to SUV or Bq/ml is present,</w:t>
+      </w:r>
+      <w:r>
+        <w:t xml:space="preserve"> </w:t>
+      </w:r>
+      <w:r>
+        <w:rPr>
+          <w:iCs/>
+          <w:i/>
+          <w:bCs/>
+          <w:b/>
+        </w:rPr>
+        <w:t xml:space="preserve">and the Rescale Type (0028, 1054) is set to a BQML, GML, or CM2ML, convert the stored values to the corresponding physical units using</w:t>
+      </w:r>
+      <w:r>
+        <w:t xml:space="preserve"> </w:t>
+      </w:r>
+      <w:r>
+        <w:rPr>
+          <w:iCs/>
+          <w:i/>
+          <w:bCs/>
+          <w:b/>
+        </w:rPr>
+        <w:t xml:space="preserve">the Rescale Intercept (0028,1052) and Rescale Slope (0028,1053) from the Pixel Value Transformation Sequence (0028,9145).</w:t>
+      </w:r>
+    </w:p>
+    <w:p>
+      <w:pPr>
+        <w:pStyle w:val="BodyText"/>
+      </w:pPr>
+      <w:r>
+        <w:t xml:space="preserve">Justification: An alternative that is similar to the Positron Emission Tomography SOP Class.</w:t>
+      </w:r>
+      <w:r>
+        <w:t xml:space="preserve"> </w:t>
+      </w:r>
+      <w:r>
+        <w:t xml:space="preserve">Rescale Type (0028, 1054) is used to indicate the physical units of the stored values.</w:t>
+      </w:r>
+      <w:r>
+        <w:t xml:space="preserve"> </w:t>
+      </w:r>
+      <w:r>
+        <w:t xml:space="preserve">However, it is a fallback option as the attribute is supposed to be unspecified for PET (</w:t>
+      </w:r>
+      <w:r>
+        <w:t xml:space="preserve">“</w:t>
+      </w:r>
+      <w:r>
+        <w:t xml:space="preserve">US</w:t>
+      </w:r>
+      <w:r>
+        <w:t xml:space="preserve">”</w:t>
+      </w:r>
+      <w:r>
+        <w:t xml:space="preserve">).</w:t>
+      </w:r>
+    </w:p>
+    <w:p>
+      <w:pPr>
+        <w:pStyle w:val="BodyText"/>
+      </w:pPr>
+      <w:r>
+        <w:rPr>
+          <w:iCs/>
+          <w:i/>
+          <w:bCs/>
+          <w:b/>
+        </w:rPr>
+        <w:t xml:space="preserve">If the conversion between SUV types is required, the Patient’s Weight (0010,1030) and the Patient’s Size (0010,1020) must have a positive, non-zero value; otherwise, SUV</w:t>
+      </w:r>
+      <w:r>
+        <w:rPr>
+          <w:vertAlign w:val="subscript"/>
+          <w:iCs/>
+          <w:i/>
+          <w:bCs/>
+          <w:b/>
+        </w:rPr>
+        <w:t xml:space="preserve">bw</w:t>
+      </w:r>
+      <w:r>
+        <w:rPr>
+          <w:iCs/>
+          <w:i/>
+          <w:bCs/>
+          <w:b/>
+        </w:rPr>
+        <w:t xml:space="preserve"> </w:t>
+      </w:r>
+      <w:r>
+        <w:rPr>
+          <w:iCs/>
+          <w:i/>
+          <w:bCs/>
+          <w:b/>
+        </w:rPr>
         <w:t xml:space="preserve">computation is not possible.</w:t>
       </w:r>
       <w:r>
@@ -15883,7 +16173,142 @@
           <w:bCs/>
           <w:b/>
         </w:rPr>
-        <w:t xml:space="preserve">If the conversion between SUV types is required, the Patient’s Weight (0010,1030) and the Patient’s Size (0010,1020) must have a positive, non-zero value; otherwise, SUV</w:t>
+        <w:t xml:space="preserve">Furthermore, if the sex of the patient is required to be known for the calculation, the Patient’s Sex (0010,1040) must have one of the values</w:t>
+      </w:r>
+      <w:r>
+        <w:rPr>
+          <w:iCs/>
+          <w:i/>
+          <w:bCs/>
+          <w:b/>
+        </w:rPr>
+        <w:t xml:space="preserve"> </w:t>
+      </w:r>
+      <w:r>
+        <w:rPr>
+          <w:iCs/>
+          <w:i/>
+          <w:bCs/>
+          <w:b/>
+        </w:rPr>
+        <w:t xml:space="preserve">“</w:t>
+      </w:r>
+      <w:r>
+        <w:rPr>
+          <w:iCs/>
+          <w:i/>
+          <w:bCs/>
+          <w:b/>
+        </w:rPr>
+        <w:t xml:space="preserve">M</w:t>
+      </w:r>
+      <w:r>
+        <w:rPr>
+          <w:iCs/>
+          <w:i/>
+          <w:bCs/>
+          <w:b/>
+        </w:rPr>
+        <w:t xml:space="preserve">”</w:t>
+      </w:r>
+      <w:r>
+        <w:rPr>
+          <w:iCs/>
+          <w:i/>
+          <w:bCs/>
+          <w:b/>
+        </w:rPr>
+        <w:t xml:space="preserve">,</w:t>
+      </w:r>
+      <w:r>
+        <w:rPr>
+          <w:iCs/>
+          <w:i/>
+          <w:bCs/>
+          <w:b/>
+        </w:rPr>
+        <w:t xml:space="preserve"> </w:t>
+      </w:r>
+      <w:r>
+        <w:rPr>
+          <w:iCs/>
+          <w:i/>
+          <w:bCs/>
+          <w:b/>
+        </w:rPr>
+        <w:t xml:space="preserve">“</w:t>
+      </w:r>
+      <w:r>
+        <w:rPr>
+          <w:iCs/>
+          <w:i/>
+          <w:bCs/>
+          <w:b/>
+        </w:rPr>
+        <w:t xml:space="preserve">F</w:t>
+      </w:r>
+      <w:r>
+        <w:rPr>
+          <w:iCs/>
+          <w:i/>
+          <w:bCs/>
+          <w:b/>
+        </w:rPr>
+        <w:t xml:space="preserve">”</w:t>
+      </w:r>
+      <w:r>
+        <w:rPr>
+          <w:iCs/>
+          <w:i/>
+          <w:bCs/>
+          <w:b/>
+        </w:rPr>
+        <w:t xml:space="preserve">, or</w:t>
+      </w:r>
+      <w:r>
+        <w:rPr>
+          <w:iCs/>
+          <w:i/>
+          <w:bCs/>
+          <w:b/>
+        </w:rPr>
+        <w:t xml:space="preserve"> </w:t>
+      </w:r>
+      <w:r>
+        <w:rPr>
+          <w:iCs/>
+          <w:i/>
+          <w:bCs/>
+          <w:b/>
+        </w:rPr>
+        <w:t xml:space="preserve">“</w:t>
+      </w:r>
+      <w:r>
+        <w:rPr>
+          <w:iCs/>
+          <w:i/>
+          <w:bCs/>
+          <w:b/>
+        </w:rPr>
+        <w:t xml:space="preserve">O</w:t>
+      </w:r>
+      <w:r>
+        <w:rPr>
+          <w:iCs/>
+          <w:i/>
+          <w:bCs/>
+          <w:b/>
+        </w:rPr>
+        <w:t xml:space="preserve">”</w:t>
+      </w:r>
+      <w:r>
+        <w:rPr>
+          <w:iCs/>
+          <w:i/>
+          <w:bCs/>
+          <w:b/>
+        </w:rPr>
+        <w:t xml:space="preserve">; otherwise, SUV</w:t>
       </w:r>
       <w:r>
         <w:rPr>
@@ -15923,142 +16348,45 @@
           <w:bCs/>
           <w:b/>
         </w:rPr>
-        <w:t xml:space="preserve">Furthermore, if the sex of the patient is required to be known for the calculation, the Patient’s Sex (0010,1040) must have one of the values</w:t>
-      </w:r>
-      <w:r>
-        <w:rPr>
-          <w:iCs/>
-          <w:i/>
-          <w:bCs/>
-          <w:b/>
-        </w:rPr>
-        <w:t xml:space="preserve"> </w:t>
-      </w:r>
-      <w:r>
-        <w:rPr>
-          <w:iCs/>
-          <w:i/>
-          <w:bCs/>
-          <w:b/>
-        </w:rPr>
-        <w:t xml:space="preserve">“</w:t>
-      </w:r>
-      <w:r>
-        <w:rPr>
-          <w:iCs/>
-          <w:i/>
-          <w:bCs/>
-          <w:b/>
-        </w:rPr>
-        <w:t xml:space="preserve">M</w:t>
-      </w:r>
-      <w:r>
-        <w:rPr>
-          <w:iCs/>
-          <w:i/>
-          <w:bCs/>
-          <w:b/>
-        </w:rPr>
-        <w:t xml:space="preserve">”</w:t>
-      </w:r>
-      <w:r>
-        <w:rPr>
-          <w:iCs/>
-          <w:i/>
-          <w:bCs/>
-          <w:b/>
-        </w:rPr>
-        <w:t xml:space="preserve">,</w:t>
-      </w:r>
-      <w:r>
-        <w:rPr>
-          <w:iCs/>
-          <w:i/>
-          <w:bCs/>
-          <w:b/>
-        </w:rPr>
-        <w:t xml:space="preserve"> </w:t>
-      </w:r>
-      <w:r>
-        <w:rPr>
-          <w:iCs/>
-          <w:i/>
-          <w:bCs/>
-          <w:b/>
-        </w:rPr>
-        <w:t xml:space="preserve">“</w:t>
-      </w:r>
-      <w:r>
-        <w:rPr>
-          <w:iCs/>
-          <w:i/>
-          <w:bCs/>
-          <w:b/>
-        </w:rPr>
-        <w:t xml:space="preserve">F</w:t>
-      </w:r>
-      <w:r>
-        <w:rPr>
-          <w:iCs/>
-          <w:i/>
-          <w:bCs/>
-          <w:b/>
-        </w:rPr>
-        <w:t xml:space="preserve">”</w:t>
-      </w:r>
-      <w:r>
-        <w:rPr>
-          <w:iCs/>
-          <w:i/>
-          <w:bCs/>
-          <w:b/>
-        </w:rPr>
-        <w:t xml:space="preserve">, or</w:t>
-      </w:r>
-      <w:r>
-        <w:rPr>
-          <w:iCs/>
-          <w:i/>
-          <w:bCs/>
-          <w:b/>
-        </w:rPr>
-        <w:t xml:space="preserve"> </w:t>
-      </w:r>
-      <w:r>
-        <w:rPr>
-          <w:iCs/>
-          <w:i/>
-          <w:bCs/>
-          <w:b/>
-        </w:rPr>
-        <w:t xml:space="preserve">“</w:t>
-      </w:r>
-      <w:r>
-        <w:rPr>
-          <w:iCs/>
-          <w:i/>
-          <w:bCs/>
-          <w:b/>
-        </w:rPr>
-        <w:t xml:space="preserve">O</w:t>
-      </w:r>
-      <w:r>
-        <w:rPr>
-          <w:iCs/>
-          <w:i/>
-          <w:bCs/>
-          <w:b/>
-        </w:rPr>
-        <w:t xml:space="preserve">”</w:t>
-      </w:r>
-      <w:r>
-        <w:rPr>
-          <w:iCs/>
-          <w:i/>
-          <w:bCs/>
-          <w:b/>
-        </w:rPr>
-        <w:t xml:space="preserve">; otherwise, SUV</w:t>
+        <w:t xml:space="preserve">The conversion between SUV types should be done using the aforementioned conversion formulas.</w:t>
+      </w:r>
+    </w:p>
+    <w:p>
+      <w:pPr>
+        <w:pStyle w:val="BodyText"/>
+      </w:pPr>
+      <w:r>
+        <w:rPr>
+          <w:iCs/>
+          <w:i/>
+          <w:bCs/>
+          <w:b/>
+        </w:rPr>
+        <w:t xml:space="preserve">The corresponding conversion has to be applied to all stored voxel values within a frame.</w:t>
+      </w:r>
+      <w:r>
+        <w:t xml:space="preserve"> </w:t>
+      </w:r>
+      <w:r>
+        <w:rPr>
+          <w:iCs/>
+          <w:i/>
+          <w:bCs/>
+          <w:b/>
+        </w:rPr>
+        <w:t xml:space="preserve">If no Real World Value Mapping Sequence (0040,9096) or Pixel Value Transformation Sequence (0028,9145) containing sufficient information for conversion to SUV or Bq/ml is present,</w:t>
+      </w:r>
+      <w:r>
+        <w:t xml:space="preserve"> </w:t>
+      </w:r>
+      <w:r>
+        <w:rPr>
+          <w:iCs/>
+          <w:i/>
+          <w:bCs/>
+          <w:b/>
+        </w:rPr>
+        <w:t xml:space="preserve">SUV</w:t>
       </w:r>
       <w:r>
         <w:rPr>
@@ -16087,72 +16415,6 @@
           <w:b/>
         </w:rPr>
         <w:t xml:space="preserve">computation is not possible.</w:t>
-      </w:r>
-      <w:r>
-        <w:t xml:space="preserve"> </w:t>
-      </w:r>
-      <w:r>
-        <w:rPr>
-          <w:iCs/>
-          <w:i/>
-          <w:bCs/>
-          <w:b/>
-        </w:rPr>
-        <w:t xml:space="preserve">The conversion between SUV types should be done using the aforementioned conversion formulas.</w:t>
-      </w:r>
-      <w:r>
-        <w:t xml:space="preserve"> </w:t>
-      </w:r>
-      <w:r>
-        <w:rPr>
-          <w:iCs/>
-          <w:i/>
-          <w:bCs/>
-          <w:b/>
-        </w:rPr>
-        <w:t xml:space="preserve">If the units correspond to Bq/ml, conversion to SUV</w:t>
-      </w:r>
-      <w:r>
-        <w:rPr>
-          <w:vertAlign w:val="subscript"/>
-          <w:iCs/>
-          <w:i/>
-          <w:bCs/>
-          <w:b/>
-        </w:rPr>
-        <w:t xml:space="preserve">bw</w:t>
-      </w:r>
-      <w:r>
-        <w:rPr>
-          <w:iCs/>
-          <w:i/>
-          <w:bCs/>
-          <w:b/>
-        </w:rPr>
-        <w:t xml:space="preserve"> </w:t>
-      </w:r>
-      <w:r>
-        <w:rPr>
-          <w:iCs/>
-          <w:i/>
-          <w:bCs/>
-          <w:b/>
-        </w:rPr>
-        <w:t xml:space="preserve">and dose correction are required.</w:t>
-      </w:r>
-    </w:p>
-    <w:p>
-      <w:pPr>
-        <w:pStyle w:val="BodyText"/>
-      </w:pPr>
-      <w:r>
-        <w:t xml:space="preserve">Justification: Analogous to the Positron Emission Tomography SOP Class. Unit code can be stored either in (0008,0100) Code Value, (0008,0119) Long Code Value, or (0008,0120) URN Code Value.</w:t>
-      </w:r>
-      <w:r>
-        <w:t xml:space="preserve"> </w:t>
-      </w:r>
-      <w:r>
-        <w:t xml:space="preserve">Each stores different types of codes.</w:t>
       </w:r>
     </w:p>
     <w:p>

</xml_diff>